<commit_message>
Remove RAG diagram instruction from completed submission
</commit_message>
<xml_diff>
--- a/submission/completed_submission.docx
+++ b/submission/completed_submission.docx
@@ -699,21 +699,6 @@
       <w:proofErr w:type="gramEnd"/>
       <w:r>
         <w:t xml:space="preserve"> Diagram / Flowchart</w:t>
-      </w:r>
-    </w:p>
-    <w:p>
-      <w:pPr>
-        <w:spacing w:after="140"/>
-      </w:pPr>
-      <w:r>
-        <w:rPr>
-          <w:i/>
-          <w:iCs/>
-          <w:color w:val="7A7A7A"/>
-          <w:sz w:val="21"/>
-          <w:szCs w:val="21"/>
-        </w:rPr>
-        <w:t>Paste your own diagram. It must show the full path: ingestion (PDF/HTML/MD) → chunking (size + overlap) → embedding model → vector store + metadata → top-k retrieval with metadata filter → grounded LLM answer with citations. Mark where the “no relevant context” branch goes.</w:t>
       </w:r>
     </w:p>
     <w:tbl>

</xml_diff>